<commit_message>
Troca tema de 28/10: post viral "noiva fantasma" no lugar de grupo de WhatsApp x chamado oficial
- 28/10 agora traz um carrossel de 2 cards no formato "coisas que só
  acontecem em condomínio" (mesmo estilo do post do ET já usado antes):
  imagem chocante (cachorra com cortina na cabeça, parecendo um
  fantasma na janela) seguida da revelação (print da mensagem do
  síndico pedindo pro dono controlar a cachorra), com créditos a
  @danilopraxedes na legenda e nos stories
- O tema anterior de 28/10 (grupo de WhatsApp x chamado oficial) foi
  movido para o banco de posts estáticos do calendário de novembro

Co-Authored-By: Claude Sonnet 5 <noreply@anthropic.com>
Claude-Session: https://claude.ai/code/session_01Qco3rELextfq6k1B91gUBk
</commit_message>
<xml_diff>
--- a/strategia-sindicos/calendarios-editoriais/Calendario_Editorial_Strategia_Novembro2026.docx
+++ b/strategia-sindicos/calendarios-editoriais/Calendario_Editorial_Strategia_Novembro2026.docx
@@ -2263,6 +2263,168 @@
           <w:b w:val="0"/>
         </w:rPr>
         <w:t>S3: Comenta ORÇAMENTO e vê como a Strategia ajuda nisso. 👆</w:t>
+      </w:r>
+    </w:p>
+    <w:p/>
+    <w:p>
+      <w:pPr>
+        <w:pStyle w:val="Heading2"/>
+      </w:pPr>
+      <w:r>
+        <w:t>BANCO DE POSTS ESTÁTICOS — Grupo de WhatsApp x chamado oficial (movido do calendário de outubro)</w:t>
+      </w:r>
+    </w:p>
+    <w:p>
+      <w:pPr/>
+      <w:r>
+        <w:rPr>
+          <w:b/>
+        </w:rPr>
+        <w:t>Estava reservado para 28/10, mas a cliente trocou por outro tema (post da "noiva fantasma"). Ainda sem data definida em novembro.</w:t>
+      </w:r>
+    </w:p>
+    <w:p>
+      <w:pPr/>
+      <w:r>
+        <w:rPr>
+          <w:b w:val="0"/>
+        </w:rPr>
+        <w:t>Objetivo: Engajamento leve com fundo educativo</w:t>
+      </w:r>
+    </w:p>
+    <w:p>
+      <w:pPr/>
+      <w:r>
+        <w:rPr>
+          <w:b w:val="0"/>
+        </w:rPr>
+        <w:t>Temática macro: Reclamar no grupo do condomínio resolve mais rápido do que abrir um chamado oficial?</w:t>
+      </w:r>
+    </w:p>
+    <w:p>
+      <w:pPr/>
+      <w:r>
+        <w:rPr>
+          <w:b w:val="0"/>
+        </w:rPr>
+        <w:t>Eixo: Gatilho de humor/curiosidade: a crença comum de que o grupo de WhatsApp "resolve tudo mais rápido" · Desejo: entender por que registrar formalmente funciona melhor</w:t>
+      </w:r>
+    </w:p>
+    <w:p>
+      <w:pPr/>
+      <w:r>
+        <w:rPr>
+          <w:b/>
+        </w:rPr>
+        <w:t>Conteúdo do post</w:t>
+      </w:r>
+    </w:p>
+    <w:p>
+      <w:pPr/>
+      <w:r>
+        <w:rPr>
+          <w:b w:val="0"/>
+        </w:rPr>
+        <w:t>Formato: post estático, mito ou verdade</w:t>
+      </w:r>
+    </w:p>
+    <w:p>
+      <w:pPr/>
+      <w:r>
+        <w:rPr>
+          <w:b w:val="0"/>
+        </w:rPr>
+        <w:t>Headline: Reclamar no grupo do condomínio resolve mais rápido que abrir um chamado oficial? 👀</w:t>
+      </w:r>
+    </w:p>
+    <w:p>
+      <w:pPr/>
+      <w:r>
+        <w:rPr>
+          <w:b w:val="0"/>
+        </w:rPr>
+        <w:t>Sub-headline: Resposta na legenda.</w:t>
+      </w:r>
+    </w:p>
+    <w:p>
+      <w:pPr/>
+      <w:r>
+        <w:rPr>
+          <w:b w:val="0"/>
+        </w:rPr>
+        <w:t>Visual: celular com notificações de grupo de WhatsApp (ilustração leve, tom de humor), fundo escuro.</w:t>
+      </w:r>
+    </w:p>
+    <w:p>
+      <w:pPr/>
+      <w:r>
+        <w:rPr>
+          <w:b/>
+        </w:rPr>
+        <w:t>Legenda</w:t>
+      </w:r>
+    </w:p>
+    <w:p>
+      <w:pPr/>
+      <w:r>
+        <w:rPr>
+          <w:b w:val="0"/>
+        </w:rPr>
+        <w:t>Parece que sim, né? A mensagem sai na hora, todo mundo vê, alguém sempre responde rápido...</w:t>
+      </w:r>
+    </w:p>
+    <w:p>
+      <w:pPr/>
+      <w:r>
+        <w:rPr>
+          <w:b w:val="0"/>
+        </w:rPr>
+        <w:t>Só que resposta rápida não é a mesma coisa que solução registrada. No grupo, ninguém sabe quem ficou responsável, não tem prazo, e a reclamação se perde entre o áudio de 4 minutos e a foto do cachorro do vizinho.</w:t>
+      </w:r>
+    </w:p>
+    <w:p>
+      <w:pPr/>
+      <w:r>
+        <w:rPr>
+          <w:b w:val="0"/>
+        </w:rPr>
+        <w:t>Já um chamado oficial fica registrado, tem prazo de resposta e permite cobrar andamento — mesmo que a resposta inicial demore um pouco mais.</w:t>
+      </w:r>
+    </w:p>
+    <w:p>
+      <w:pPr/>
+      <w:r>
+        <w:rPr>
+          <w:b w:val="0"/>
+        </w:rPr>
+        <w:t>Comente: CHAMADO e a gente te explica como estruturar isso no seu condomínio.</w:t>
+      </w:r>
+    </w:p>
+    <w:p>
+      <w:pPr/>
+      <w:r>
+        <w:rPr>
+          <w:b/>
+        </w:rPr>
+        <w:t>Stories (sequência de 2)</w:t>
+      </w:r>
+    </w:p>
+    <w:p>
+      <w:pPr/>
+      <w:r>
+        <w:rPr>
+          <w:b w:val="0"/>
+        </w:rPr>
+        <w:t>S1: Seu condomínio resolve tudo pelo grupo de WhatsApp? (enquete: Sim, é assim mesmo / Não, tem canal oficial)</w:t>
+      </w:r>
+    </w:p>
+    <w:p>
+      <w:pPr/>
+      <w:r>
+        <w:rPr>
+          <w:b w:val="0"/>
+        </w:rPr>
+        <w:t>S2: A resposta completa está no post de hoje. Confere lá e comenta CHAMADO. 👆</w:t>
       </w:r>
     </w:p>
     <w:sectPr>

</xml_diff>